<commit_message>
version good avec tri de configuration
les configurations sont triées convenablements, mais ne sont pas regroupée
</commit_message>
<xml_diff>
--- a/out/Processed_RAW00.docx
+++ b/out/Processed_RAW00.docx
@@ -20,7 +20,7 @@
         <w:pStyle w:val="Heading1"/>
       </w:pPr>
       <w:r>
-        <w:t>Sample n°CRE2-2025-TP002-02</w:t>
+        <w:t>Sample n°CRE2-2025-TP002-01</w:t>
       </w:r>
     </w:p>
     <w:p>
@@ -28,7 +28,7 @@
         <w:pStyle w:val="Heading2"/>
       </w:pPr>
       <w:r>
-        <w:t>Configuration ER_In front of harness RBW 9kHz</w:t>
+        <w:t>Configuration ER_In front of DUT RBW 120kHz</w:t>
       </w:r>
     </w:p>
     <w:p>
@@ -43,7 +43,7 @@
     </w:p>
     <w:p>
       <w:r>
-        <w:t xml:space="preserve">  • Operator: VA/FK, 17/02/2025 17:31:53</w:t>
+        <w:t xml:space="preserve">  • Operator: VA/FK, 17/02/2025 17:42:15</w:t>
       </w:r>
     </w:p>
     <w:p>
@@ -228,7 +228,7 @@
           </w:tcPr>
           <w:p>
             <w:r>
-              <w:t>36</w:t>
+              <w:t>2</w:t>
             </w:r>
           </w:p>
         </w:tc>
@@ -261,7 +261,7 @@
           </w:tcPr>
           <w:p>
             <w:r>
-              <w:t>27.269</w:t>
+              <w:t>432.560</w:t>
             </w:r>
           </w:p>
         </w:tc>
@@ -281,7 +281,7 @@
           </w:tcPr>
           <w:p>
             <w:r>
-              <w:t>Peak</w:t>
+              <w:t>Pk</w:t>
             </w:r>
           </w:p>
         </w:tc>
@@ -293,6 +293,170 @@
             <w:r>
               <w:t>-</w:t>
             </w:r>
+          </w:p>
+        </w:tc>
+      </w:tr>
+      <w:tr>
+        <w:tc>
+          <w:tcPr>
+            <w:tcW w:type="dxa" w:w="960"/>
+          </w:tcPr>
+          <w:p>
+            <w:r/>
+          </w:p>
+        </w:tc>
+        <w:tc>
+          <w:tcPr>
+            <w:tcW w:type="dxa" w:w="960"/>
+          </w:tcPr>
+          <w:p>
+            <w:r/>
+          </w:p>
+        </w:tc>
+        <w:tc>
+          <w:tcPr>
+            <w:tcW w:type="dxa" w:w="960"/>
+          </w:tcPr>
+          <w:p>
+            <w:r>
+              <w:t>0</w:t>
+            </w:r>
+          </w:p>
+        </w:tc>
+        <w:tc>
+          <w:tcPr>
+            <w:tcW w:type="dxa" w:w="960"/>
+          </w:tcPr>
+          <w:p>
+            <w:r>
+              <w:t>-</w:t>
+            </w:r>
+          </w:p>
+        </w:tc>
+        <w:tc>
+          <w:tcPr>
+            <w:tcW w:type="dxa" w:w="960"/>
+          </w:tcPr>
+          <w:p>
+            <w:r/>
+          </w:p>
+        </w:tc>
+        <w:tc>
+          <w:tcPr>
+            <w:tcW w:type="dxa" w:w="960"/>
+          </w:tcPr>
+          <w:p>
+            <w:r>
+              <w:t>174.240</w:t>
+            </w:r>
+          </w:p>
+        </w:tc>
+        <w:tc>
+          <w:tcPr>
+            <w:tcW w:type="dxa" w:w="960"/>
+          </w:tcPr>
+          <w:p>
+            <w:r/>
+          </w:p>
+        </w:tc>
+        <w:tc>
+          <w:tcPr>
+            <w:tcW w:type="dxa" w:w="960"/>
+          </w:tcPr>
+          <w:p>
+            <w:r>
+              <w:t>QPk</w:t>
+            </w:r>
+          </w:p>
+        </w:tc>
+        <w:tc>
+          <w:tcPr>
+            <w:tcW w:type="dxa" w:w="960"/>
+          </w:tcPr>
+          <w:p>
+            <w:r/>
+          </w:p>
+        </w:tc>
+      </w:tr>
+      <w:tr>
+        <w:tc>
+          <w:tcPr>
+            <w:tcW w:type="dxa" w:w="960"/>
+          </w:tcPr>
+          <w:p>
+            <w:r/>
+          </w:p>
+        </w:tc>
+        <w:tc>
+          <w:tcPr>
+            <w:tcW w:type="dxa" w:w="960"/>
+          </w:tcPr>
+          <w:p>
+            <w:r/>
+          </w:p>
+        </w:tc>
+        <w:tc>
+          <w:tcPr>
+            <w:tcW w:type="dxa" w:w="960"/>
+          </w:tcPr>
+          <w:p>
+            <w:r>
+              <w:t>6</w:t>
+            </w:r>
+          </w:p>
+        </w:tc>
+        <w:tc>
+          <w:tcPr>
+            <w:tcW w:type="dxa" w:w="960"/>
+          </w:tcPr>
+          <w:p>
+            <w:r>
+              <w:t>-</w:t>
+            </w:r>
+          </w:p>
+        </w:tc>
+        <w:tc>
+          <w:tcPr>
+            <w:tcW w:type="dxa" w:w="960"/>
+          </w:tcPr>
+          <w:p>
+            <w:r/>
+          </w:p>
+        </w:tc>
+        <w:tc>
+          <w:tcPr>
+            <w:tcW w:type="dxa" w:w="960"/>
+          </w:tcPr>
+          <w:p>
+            <w:r>
+              <w:t>99.510</w:t>
+            </w:r>
+          </w:p>
+        </w:tc>
+        <w:tc>
+          <w:tcPr>
+            <w:tcW w:type="dxa" w:w="960"/>
+          </w:tcPr>
+          <w:p>
+            <w:r/>
+          </w:p>
+        </w:tc>
+        <w:tc>
+          <w:tcPr>
+            <w:tcW w:type="dxa" w:w="960"/>
+          </w:tcPr>
+          <w:p>
+            <w:r>
+              <w:t>CISPR.AVG</w:t>
+            </w:r>
+          </w:p>
+        </w:tc>
+        <w:tc>
+          <w:tcPr>
+            <w:tcW w:type="dxa" w:w="960"/>
+          </w:tcPr>
+          <w:p>
+            <w:r/>
           </w:p>
         </w:tc>
       </w:tr>
@@ -302,7 +466,7 @@
         <w:pStyle w:val="Heading2"/>
       </w:pPr>
       <w:r>
-        <w:t>Configuration ER_In front of harness RBW 9kHz_GNSS</w:t>
+        <w:t>Configuration ER_In front of DUT RBW 120kHz</w:t>
       </w:r>
     </w:p>
     <w:p>
@@ -317,7 +481,7 @@
     </w:p>
     <w:p>
       <w:r>
-        <w:t xml:space="preserve">  • Operator: VA/FK, 17/02/2025 17:31:53</w:t>
+        <w:t xml:space="preserve">  • Operator: VA/FK, 17/02/2025 17:42:15</w:t>
       </w:r>
     </w:p>
     <w:p>
@@ -475,18 +639,272 @@
           </w:p>
         </w:tc>
       </w:tr>
+      <w:tr>
+        <w:tc>
+          <w:tcPr>
+            <w:tcW w:type="dxa" w:w="960"/>
+          </w:tcPr>
+          <w:p>
+            <w:r>
+              <w:t>1 (X)</w:t>
+            </w:r>
+          </w:p>
+        </w:tc>
+        <w:tc>
+          <w:tcPr>
+            <w:tcW w:type="dxa" w:w="960"/>
+          </w:tcPr>
+          <w:p>
+            <w:r>
+              <w:t>Vertical</w:t>
+            </w:r>
+          </w:p>
+        </w:tc>
+        <w:tc>
+          <w:tcPr>
+            <w:tcW w:type="dxa" w:w="960"/>
+          </w:tcPr>
+          <w:p>
+            <w:r>
+              <w:t>2</w:t>
+            </w:r>
+          </w:p>
+        </w:tc>
+        <w:tc>
+          <w:tcPr>
+            <w:tcW w:type="dxa" w:w="960"/>
+          </w:tcPr>
+          <w:p>
+            <w:r>
+              <w:t>-</w:t>
+            </w:r>
+          </w:p>
+        </w:tc>
+        <w:tc>
+          <w:tcPr>
+            <w:tcW w:type="dxa" w:w="960"/>
+          </w:tcPr>
+          <w:p>
+            <w:r>
+              <w:rPr>
+                <w:color w:val="008000"/>
+              </w:rPr>
+              <w:t>OK</w:t>
+            </w:r>
+          </w:p>
+        </w:tc>
+        <w:tc>
+          <w:tcPr>
+            <w:tcW w:type="dxa" w:w="960"/>
+          </w:tcPr>
+          <w:p>
+            <w:r>
+              <w:t>432.560</w:t>
+            </w:r>
+          </w:p>
+        </w:tc>
+        <w:tc>
+          <w:tcPr>
+            <w:tcW w:type="dxa" w:w="960"/>
+          </w:tcPr>
+          <w:p>
+            <w:r>
+              <w:t>RNDS-C-00517 V4.0</w:t>
+            </w:r>
+          </w:p>
+        </w:tc>
+        <w:tc>
+          <w:tcPr>
+            <w:tcW w:type="dxa" w:w="960"/>
+          </w:tcPr>
+          <w:p>
+            <w:r>
+              <w:t>Pk</w:t>
+            </w:r>
+          </w:p>
+        </w:tc>
+        <w:tc>
+          <w:tcPr>
+            <w:tcW w:type="dxa" w:w="960"/>
+          </w:tcPr>
+          <w:p>
+            <w:r>
+              <w:t>-</w:t>
+            </w:r>
+          </w:p>
+        </w:tc>
+      </w:tr>
+      <w:tr>
+        <w:tc>
+          <w:tcPr>
+            <w:tcW w:type="dxa" w:w="960"/>
+          </w:tcPr>
+          <w:p>
+            <w:r/>
+          </w:p>
+        </w:tc>
+        <w:tc>
+          <w:tcPr>
+            <w:tcW w:type="dxa" w:w="960"/>
+          </w:tcPr>
+          <w:p>
+            <w:r/>
+          </w:p>
+        </w:tc>
+        <w:tc>
+          <w:tcPr>
+            <w:tcW w:type="dxa" w:w="960"/>
+          </w:tcPr>
+          <w:p>
+            <w:r>
+              <w:t>0</w:t>
+            </w:r>
+          </w:p>
+        </w:tc>
+        <w:tc>
+          <w:tcPr>
+            <w:tcW w:type="dxa" w:w="960"/>
+          </w:tcPr>
+          <w:p>
+            <w:r>
+              <w:t>-</w:t>
+            </w:r>
+          </w:p>
+        </w:tc>
+        <w:tc>
+          <w:tcPr>
+            <w:tcW w:type="dxa" w:w="960"/>
+          </w:tcPr>
+          <w:p>
+            <w:r/>
+          </w:p>
+        </w:tc>
+        <w:tc>
+          <w:tcPr>
+            <w:tcW w:type="dxa" w:w="960"/>
+          </w:tcPr>
+          <w:p>
+            <w:r>
+              <w:t>174.240</w:t>
+            </w:r>
+          </w:p>
+        </w:tc>
+        <w:tc>
+          <w:tcPr>
+            <w:tcW w:type="dxa" w:w="960"/>
+          </w:tcPr>
+          <w:p>
+            <w:r/>
+          </w:p>
+        </w:tc>
+        <w:tc>
+          <w:tcPr>
+            <w:tcW w:type="dxa" w:w="960"/>
+          </w:tcPr>
+          <w:p>
+            <w:r>
+              <w:t>QPk</w:t>
+            </w:r>
+          </w:p>
+        </w:tc>
+        <w:tc>
+          <w:tcPr>
+            <w:tcW w:type="dxa" w:w="960"/>
+          </w:tcPr>
+          <w:p>
+            <w:r/>
+          </w:p>
+        </w:tc>
+      </w:tr>
+      <w:tr>
+        <w:tc>
+          <w:tcPr>
+            <w:tcW w:type="dxa" w:w="960"/>
+          </w:tcPr>
+          <w:p>
+            <w:r/>
+          </w:p>
+        </w:tc>
+        <w:tc>
+          <w:tcPr>
+            <w:tcW w:type="dxa" w:w="960"/>
+          </w:tcPr>
+          <w:p>
+            <w:r/>
+          </w:p>
+        </w:tc>
+        <w:tc>
+          <w:tcPr>
+            <w:tcW w:type="dxa" w:w="960"/>
+          </w:tcPr>
+          <w:p>
+            <w:r>
+              <w:t>6</w:t>
+            </w:r>
+          </w:p>
+        </w:tc>
+        <w:tc>
+          <w:tcPr>
+            <w:tcW w:type="dxa" w:w="960"/>
+          </w:tcPr>
+          <w:p>
+            <w:r>
+              <w:t>-</w:t>
+            </w:r>
+          </w:p>
+        </w:tc>
+        <w:tc>
+          <w:tcPr>
+            <w:tcW w:type="dxa" w:w="960"/>
+          </w:tcPr>
+          <w:p>
+            <w:r/>
+          </w:p>
+        </w:tc>
+        <w:tc>
+          <w:tcPr>
+            <w:tcW w:type="dxa" w:w="960"/>
+          </w:tcPr>
+          <w:p>
+            <w:r>
+              <w:t>99.510</w:t>
+            </w:r>
+          </w:p>
+        </w:tc>
+        <w:tc>
+          <w:tcPr>
+            <w:tcW w:type="dxa" w:w="960"/>
+          </w:tcPr>
+          <w:p>
+            <w:r/>
+          </w:p>
+        </w:tc>
+        <w:tc>
+          <w:tcPr>
+            <w:tcW w:type="dxa" w:w="960"/>
+          </w:tcPr>
+          <w:p>
+            <w:r>
+              <w:t>CISPR.AVG</w:t>
+            </w:r>
+          </w:p>
+        </w:tc>
+        <w:tc>
+          <w:tcPr>
+            <w:tcW w:type="dxa" w:w="960"/>
+          </w:tcPr>
+          <w:p>
+            <w:r/>
+          </w:p>
+        </w:tc>
+      </w:tr>
     </w:tbl>
-    <w:p>
-      <w:r>
-        <w:t>Aucune donnée disponible pour cette configuration.</w:t>
-      </w:r>
-    </w:p>
     <w:p>
       <w:pPr>
         <w:pStyle w:val="Heading2"/>
       </w:pPr>
       <w:r>
-        <w:t>Configuration ER_In front of DUT RBW 9kHz_GNSS</w:t>
+        <w:t>Configuration ER_In front of DUT RBW 120kHz</w:t>
       </w:r>
     </w:p>
     <w:p>
@@ -501,7 +919,7 @@
     </w:p>
     <w:p>
       <w:r>
-        <w:t xml:space="preserve">  • Operator: VA/FK, 17/02/2025 17:31:53</w:t>
+        <w:t xml:space="preserve">  • Operator: VA/FK, 17/02/2025 17:42:15</w:t>
       </w:r>
     </w:p>
     <w:p>
@@ -659,18 +1077,272 @@
           </w:p>
         </w:tc>
       </w:tr>
+      <w:tr>
+        <w:tc>
+          <w:tcPr>
+            <w:tcW w:type="dxa" w:w="960"/>
+          </w:tcPr>
+          <w:p>
+            <w:r>
+              <w:t>1 (X)</w:t>
+            </w:r>
+          </w:p>
+        </w:tc>
+        <w:tc>
+          <w:tcPr>
+            <w:tcW w:type="dxa" w:w="960"/>
+          </w:tcPr>
+          <w:p>
+            <w:r>
+              <w:t>Vertical</w:t>
+            </w:r>
+          </w:p>
+        </w:tc>
+        <w:tc>
+          <w:tcPr>
+            <w:tcW w:type="dxa" w:w="960"/>
+          </w:tcPr>
+          <w:p>
+            <w:r>
+              <w:t>2</w:t>
+            </w:r>
+          </w:p>
+        </w:tc>
+        <w:tc>
+          <w:tcPr>
+            <w:tcW w:type="dxa" w:w="960"/>
+          </w:tcPr>
+          <w:p>
+            <w:r>
+              <w:t>-</w:t>
+            </w:r>
+          </w:p>
+        </w:tc>
+        <w:tc>
+          <w:tcPr>
+            <w:tcW w:type="dxa" w:w="960"/>
+          </w:tcPr>
+          <w:p>
+            <w:r>
+              <w:rPr>
+                <w:color w:val="008000"/>
+              </w:rPr>
+              <w:t>OK</w:t>
+            </w:r>
+          </w:p>
+        </w:tc>
+        <w:tc>
+          <w:tcPr>
+            <w:tcW w:type="dxa" w:w="960"/>
+          </w:tcPr>
+          <w:p>
+            <w:r>
+              <w:t>432.560</w:t>
+            </w:r>
+          </w:p>
+        </w:tc>
+        <w:tc>
+          <w:tcPr>
+            <w:tcW w:type="dxa" w:w="960"/>
+          </w:tcPr>
+          <w:p>
+            <w:r>
+              <w:t>RNDS-C-00517 V4.0</w:t>
+            </w:r>
+          </w:p>
+        </w:tc>
+        <w:tc>
+          <w:tcPr>
+            <w:tcW w:type="dxa" w:w="960"/>
+          </w:tcPr>
+          <w:p>
+            <w:r>
+              <w:t>Pk</w:t>
+            </w:r>
+          </w:p>
+        </w:tc>
+        <w:tc>
+          <w:tcPr>
+            <w:tcW w:type="dxa" w:w="960"/>
+          </w:tcPr>
+          <w:p>
+            <w:r>
+              <w:t>-</w:t>
+            </w:r>
+          </w:p>
+        </w:tc>
+      </w:tr>
+      <w:tr>
+        <w:tc>
+          <w:tcPr>
+            <w:tcW w:type="dxa" w:w="960"/>
+          </w:tcPr>
+          <w:p>
+            <w:r/>
+          </w:p>
+        </w:tc>
+        <w:tc>
+          <w:tcPr>
+            <w:tcW w:type="dxa" w:w="960"/>
+          </w:tcPr>
+          <w:p>
+            <w:r/>
+          </w:p>
+        </w:tc>
+        <w:tc>
+          <w:tcPr>
+            <w:tcW w:type="dxa" w:w="960"/>
+          </w:tcPr>
+          <w:p>
+            <w:r>
+              <w:t>0</w:t>
+            </w:r>
+          </w:p>
+        </w:tc>
+        <w:tc>
+          <w:tcPr>
+            <w:tcW w:type="dxa" w:w="960"/>
+          </w:tcPr>
+          <w:p>
+            <w:r>
+              <w:t>-</w:t>
+            </w:r>
+          </w:p>
+        </w:tc>
+        <w:tc>
+          <w:tcPr>
+            <w:tcW w:type="dxa" w:w="960"/>
+          </w:tcPr>
+          <w:p>
+            <w:r/>
+          </w:p>
+        </w:tc>
+        <w:tc>
+          <w:tcPr>
+            <w:tcW w:type="dxa" w:w="960"/>
+          </w:tcPr>
+          <w:p>
+            <w:r>
+              <w:t>174.240</w:t>
+            </w:r>
+          </w:p>
+        </w:tc>
+        <w:tc>
+          <w:tcPr>
+            <w:tcW w:type="dxa" w:w="960"/>
+          </w:tcPr>
+          <w:p>
+            <w:r/>
+          </w:p>
+        </w:tc>
+        <w:tc>
+          <w:tcPr>
+            <w:tcW w:type="dxa" w:w="960"/>
+          </w:tcPr>
+          <w:p>
+            <w:r>
+              <w:t>QPk</w:t>
+            </w:r>
+          </w:p>
+        </w:tc>
+        <w:tc>
+          <w:tcPr>
+            <w:tcW w:type="dxa" w:w="960"/>
+          </w:tcPr>
+          <w:p>
+            <w:r/>
+          </w:p>
+        </w:tc>
+      </w:tr>
+      <w:tr>
+        <w:tc>
+          <w:tcPr>
+            <w:tcW w:type="dxa" w:w="960"/>
+          </w:tcPr>
+          <w:p>
+            <w:r/>
+          </w:p>
+        </w:tc>
+        <w:tc>
+          <w:tcPr>
+            <w:tcW w:type="dxa" w:w="960"/>
+          </w:tcPr>
+          <w:p>
+            <w:r/>
+          </w:p>
+        </w:tc>
+        <w:tc>
+          <w:tcPr>
+            <w:tcW w:type="dxa" w:w="960"/>
+          </w:tcPr>
+          <w:p>
+            <w:r>
+              <w:t>6</w:t>
+            </w:r>
+          </w:p>
+        </w:tc>
+        <w:tc>
+          <w:tcPr>
+            <w:tcW w:type="dxa" w:w="960"/>
+          </w:tcPr>
+          <w:p>
+            <w:r>
+              <w:t>-</w:t>
+            </w:r>
+          </w:p>
+        </w:tc>
+        <w:tc>
+          <w:tcPr>
+            <w:tcW w:type="dxa" w:w="960"/>
+          </w:tcPr>
+          <w:p>
+            <w:r/>
+          </w:p>
+        </w:tc>
+        <w:tc>
+          <w:tcPr>
+            <w:tcW w:type="dxa" w:w="960"/>
+          </w:tcPr>
+          <w:p>
+            <w:r>
+              <w:t>99.510</w:t>
+            </w:r>
+          </w:p>
+        </w:tc>
+        <w:tc>
+          <w:tcPr>
+            <w:tcW w:type="dxa" w:w="960"/>
+          </w:tcPr>
+          <w:p>
+            <w:r/>
+          </w:p>
+        </w:tc>
+        <w:tc>
+          <w:tcPr>
+            <w:tcW w:type="dxa" w:w="960"/>
+          </w:tcPr>
+          <w:p>
+            <w:r>
+              <w:t>CISPR.AVG</w:t>
+            </w:r>
+          </w:p>
+        </w:tc>
+        <w:tc>
+          <w:tcPr>
+            <w:tcW w:type="dxa" w:w="960"/>
+          </w:tcPr>
+          <w:p>
+            <w:r/>
+          </w:p>
+        </w:tc>
+      </w:tr>
     </w:tbl>
-    <w:p>
-      <w:r>
-        <w:t>Aucune donnée disponible pour cette configuration.</w:t>
-      </w:r>
-    </w:p>
     <w:p>
       <w:pPr>
         <w:pStyle w:val="Heading2"/>
       </w:pPr>
       <w:r>
-        <w:t>Configuration ER_In front of harness RBW 120kHz With PA</w:t>
+        <w:t>Configuration ER_In front of DUT RBW 1MHz</w:t>
       </w:r>
     </w:p>
     <w:p>
@@ -685,7 +1357,7 @@
     </w:p>
     <w:p>
       <w:r>
-        <w:t xml:space="preserve">  • Operator: VA/FK, 17/02/2025 17:31:53</w:t>
+        <w:t xml:space="preserve">  • Operator: VA/FK, 17/02/2025 17:42:15</w:t>
       </w:r>
     </w:p>
     <w:p>
@@ -843,12 +1515,2512 @@
           </w:p>
         </w:tc>
       </w:tr>
+      <w:tr>
+        <w:tc>
+          <w:tcPr>
+            <w:tcW w:type="dxa" w:w="960"/>
+          </w:tcPr>
+          <w:p>
+            <w:r>
+              <w:t>1 (X)</w:t>
+            </w:r>
+          </w:p>
+        </w:tc>
+        <w:tc>
+          <w:tcPr>
+            <w:tcW w:type="dxa" w:w="960"/>
+          </w:tcPr>
+          <w:p>
+            <w:r>
+              <w:t>Vertical</w:t>
+            </w:r>
+          </w:p>
+        </w:tc>
+        <w:tc>
+          <w:tcPr>
+            <w:tcW w:type="dxa" w:w="960"/>
+          </w:tcPr>
+          <w:p>
+            <w:r>
+              <w:t>12</w:t>
+            </w:r>
+          </w:p>
+        </w:tc>
+        <w:tc>
+          <w:tcPr>
+            <w:tcW w:type="dxa" w:w="960"/>
+          </w:tcPr>
+          <w:p>
+            <w:r>
+              <w:t>-</w:t>
+            </w:r>
+          </w:p>
+        </w:tc>
+        <w:tc>
+          <w:tcPr>
+            <w:tcW w:type="dxa" w:w="960"/>
+          </w:tcPr>
+          <w:p>
+            <w:r>
+              <w:rPr>
+                <w:color w:val="008000"/>
+              </w:rPr>
+              <w:t>OK</w:t>
+            </w:r>
+          </w:p>
+        </w:tc>
+        <w:tc>
+          <w:tcPr>
+            <w:tcW w:type="dxa" w:w="960"/>
+          </w:tcPr>
+          <w:p>
+            <w:r>
+              <w:t>244.250</w:t>
+            </w:r>
+          </w:p>
+        </w:tc>
+        <w:tc>
+          <w:tcPr>
+            <w:tcW w:type="dxa" w:w="960"/>
+          </w:tcPr>
+          <w:p>
+            <w:r>
+              <w:t>RNDS-C-00517 V4.0</w:t>
+            </w:r>
+          </w:p>
+        </w:tc>
+        <w:tc>
+          <w:tcPr>
+            <w:tcW w:type="dxa" w:w="960"/>
+          </w:tcPr>
+          <w:p>
+            <w:r>
+              <w:t>Pk</w:t>
+            </w:r>
+          </w:p>
+        </w:tc>
+        <w:tc>
+          <w:tcPr>
+            <w:tcW w:type="dxa" w:w="960"/>
+          </w:tcPr>
+          <w:p>
+            <w:r>
+              <w:t>-</w:t>
+            </w:r>
+          </w:p>
+        </w:tc>
+      </w:tr>
+      <w:tr>
+        <w:tc>
+          <w:tcPr>
+            <w:tcW w:type="dxa" w:w="960"/>
+          </w:tcPr>
+          <w:p>
+            <w:r/>
+          </w:p>
+        </w:tc>
+        <w:tc>
+          <w:tcPr>
+            <w:tcW w:type="dxa" w:w="960"/>
+          </w:tcPr>
+          <w:p>
+            <w:r/>
+          </w:p>
+        </w:tc>
+        <w:tc>
+          <w:tcPr>
+            <w:tcW w:type="dxa" w:w="960"/>
+          </w:tcPr>
+          <w:p>
+            <w:r>
+              <w:t>10</w:t>
+            </w:r>
+          </w:p>
+        </w:tc>
+        <w:tc>
+          <w:tcPr>
+            <w:tcW w:type="dxa" w:w="960"/>
+          </w:tcPr>
+          <w:p>
+            <w:r>
+              <w:t>-</w:t>
+            </w:r>
+          </w:p>
+        </w:tc>
+        <w:tc>
+          <w:tcPr>
+            <w:tcW w:type="dxa" w:w="960"/>
+          </w:tcPr>
+          <w:p>
+            <w:r/>
+          </w:p>
+        </w:tc>
+        <w:tc>
+          <w:tcPr>
+            <w:tcW w:type="dxa" w:w="960"/>
+          </w:tcPr>
+          <w:p>
+            <w:r>
+              <w:t>244.500</w:t>
+            </w:r>
+          </w:p>
+        </w:tc>
+        <w:tc>
+          <w:tcPr>
+            <w:tcW w:type="dxa" w:w="960"/>
+          </w:tcPr>
+          <w:p>
+            <w:r/>
+          </w:p>
+        </w:tc>
+        <w:tc>
+          <w:tcPr>
+            <w:tcW w:type="dxa" w:w="960"/>
+          </w:tcPr>
+          <w:p>
+            <w:r>
+              <w:t>CISPR.AVG</w:t>
+            </w:r>
+          </w:p>
+        </w:tc>
+        <w:tc>
+          <w:tcPr>
+            <w:tcW w:type="dxa" w:w="960"/>
+          </w:tcPr>
+          <w:p>
+            <w:r/>
+          </w:p>
+        </w:tc>
+      </w:tr>
     </w:tbl>
     <w:p>
+      <w:pPr>
+        <w:pStyle w:val="Heading2"/>
+      </w:pPr>
       <w:r>
-        <w:t>Aucune donnée disponible pour cette configuration.</w:t>
+        <w:t>Configuration ER_In front of DUT RBW 9kHz_GNSS</w:t>
       </w:r>
     </w:p>
+    <w:p>
+      <w:r>
+        <w:t>Paramètres de test :</w:t>
+      </w:r>
+    </w:p>
+    <w:p>
+      <w:r>
+        <w:t xml:space="preserve">  • Project: CRE2-2025-TP002 RESAC</w:t>
+      </w:r>
+    </w:p>
+    <w:p>
+      <w:r>
+        <w:t xml:space="preserve">  • Operator: VA/FK, 17/02/2025 17:42:15</w:t>
+      </w:r>
+    </w:p>
+    <w:p>
+      <w:r>
+        <w:t xml:space="preserve">  • Test Configuration: Antenna position:in front of harness, DUT Orientation:axis X, Housing connected to the ground plane:no, Configuration of the power return line LV:remotely grounded, -</w:t>
+      </w:r>
+    </w:p>
+    <w:p>
+      <w:r>
+        <w:t xml:space="preserve">  • Operating mode: Mode 3, Conclusion  comply</w:t>
+      </w:r>
+    </w:p>
+    <w:tbl>
+      <w:tblPr>
+        <w:tblStyle w:val="TableGrid"/>
+        <w:tblW w:type="auto" w:w="0"/>
+        <w:tblLook w:firstColumn="1" w:firstRow="1" w:lastColumn="0" w:lastRow="0" w:noHBand="0" w:noVBand="1" w:val="04A0"/>
+      </w:tblPr>
+      <w:tblGrid>
+        <w:gridCol w:w="960"/>
+        <w:gridCol w:w="960"/>
+        <w:gridCol w:w="960"/>
+        <w:gridCol w:w="960"/>
+        <w:gridCol w:w="960"/>
+        <w:gridCol w:w="960"/>
+        <w:gridCol w:w="960"/>
+        <w:gridCol w:w="960"/>
+        <w:gridCol w:w="960"/>
+      </w:tblGrid>
+      <w:tr>
+        <w:tc>
+          <w:tcPr>
+            <w:tcW w:type="dxa" w:w="960"/>
+          </w:tcPr>
+          <w:p>
+            <w:r>
+              <w:rPr>
+                <w:b/>
+                <w:color w:val="000000"/>
+              </w:rPr>
+              <w:t>Antenna Position (Axis equipment)</w:t>
+            </w:r>
+          </w:p>
+        </w:tc>
+        <w:tc>
+          <w:tcPr>
+            <w:tcW w:type="dxa" w:w="960"/>
+          </w:tcPr>
+          <w:p>
+            <w:r>
+              <w:rPr>
+                <w:b/>
+                <w:color w:val="000000"/>
+              </w:rPr>
+              <w:t>Polarization of antenna</w:t>
+            </w:r>
+          </w:p>
+        </w:tc>
+        <w:tc>
+          <w:tcPr>
+            <w:tcW w:type="dxa" w:w="960"/>
+          </w:tcPr>
+          <w:p>
+            <w:r>
+              <w:rPr>
+                <w:b/>
+                <w:color w:val="000000"/>
+              </w:rPr>
+              <w:t>Margin (dB)</w:t>
+            </w:r>
+          </w:p>
+        </w:tc>
+        <w:tc>
+          <w:tcPr>
+            <w:tcW w:type="dxa" w:w="960"/>
+          </w:tcPr>
+          <w:p>
+            <w:r>
+              <w:rPr>
+                <w:b/>
+                <w:color w:val="000000"/>
+              </w:rPr>
+              <w:t>Overtaking (dB)</w:t>
+            </w:r>
+          </w:p>
+        </w:tc>
+        <w:tc>
+          <w:tcPr>
+            <w:tcW w:type="dxa" w:w="960"/>
+          </w:tcPr>
+          <w:p>
+            <w:r>
+              <w:rPr>
+                <w:b/>
+                <w:color w:val="000000"/>
+              </w:rPr>
+              <w:t>Conformity</w:t>
+            </w:r>
+          </w:p>
+        </w:tc>
+        <w:tc>
+          <w:tcPr>
+            <w:tcW w:type="dxa" w:w="960"/>
+          </w:tcPr>
+          <w:p>
+            <w:r>
+              <w:rPr>
+                <w:b/>
+                <w:color w:val="000000"/>
+              </w:rPr>
+              <w:t>Frequency (MHz)</w:t>
+            </w:r>
+          </w:p>
+        </w:tc>
+        <w:tc>
+          <w:tcPr>
+            <w:tcW w:type="dxa" w:w="960"/>
+          </w:tcPr>
+          <w:p>
+            <w:r>
+              <w:rPr>
+                <w:b/>
+                <w:color w:val="000000"/>
+              </w:rPr>
+              <w:t>Applied limit</w:t>
+            </w:r>
+          </w:p>
+        </w:tc>
+        <w:tc>
+          <w:tcPr>
+            <w:tcW w:type="dxa" w:w="960"/>
+          </w:tcPr>
+          <w:p>
+            <w:r>
+              <w:rPr>
+                <w:b/>
+                <w:color w:val="000000"/>
+              </w:rPr>
+              <w:t>Detector type</w:t>
+            </w:r>
+          </w:p>
+        </w:tc>
+        <w:tc>
+          <w:tcPr>
+            <w:tcW w:type="dxa" w:w="960"/>
+          </w:tcPr>
+          <w:p>
+            <w:r>
+              <w:rPr>
+                <w:b/>
+                <w:color w:val="000000"/>
+              </w:rPr>
+              <w:t>Comment</w:t>
+            </w:r>
+          </w:p>
+        </w:tc>
+      </w:tr>
+      <w:tr>
+        <w:tc>
+          <w:tcPr>
+            <w:tcW w:type="dxa" w:w="960"/>
+          </w:tcPr>
+          <w:p>
+            <w:r>
+              <w:t>1 (X)</w:t>
+            </w:r>
+          </w:p>
+        </w:tc>
+        <w:tc>
+          <w:tcPr>
+            <w:tcW w:type="dxa" w:w="960"/>
+          </w:tcPr>
+          <w:p>
+            <w:r>
+              <w:t>Vertical</w:t>
+            </w:r>
+          </w:p>
+        </w:tc>
+        <w:tc>
+          <w:tcPr>
+            <w:tcW w:type="dxa" w:w="960"/>
+          </w:tcPr>
+          <w:p>
+            <w:r>
+              <w:t>4</w:t>
+            </w:r>
+          </w:p>
+        </w:tc>
+        <w:tc>
+          <w:tcPr>
+            <w:tcW w:type="dxa" w:w="960"/>
+          </w:tcPr>
+          <w:p>
+            <w:r>
+              <w:t>-</w:t>
+            </w:r>
+          </w:p>
+        </w:tc>
+        <w:tc>
+          <w:tcPr>
+            <w:tcW w:type="dxa" w:w="960"/>
+          </w:tcPr>
+          <w:p>
+            <w:r>
+              <w:rPr>
+                <w:color w:val="008000"/>
+              </w:rPr>
+              <w:t>OK</w:t>
+            </w:r>
+          </w:p>
+        </w:tc>
+        <w:tc>
+          <w:tcPr>
+            <w:tcW w:type="dxa" w:w="960"/>
+          </w:tcPr>
+          <w:p>
+            <w:r>
+              <w:t>1175.910</w:t>
+            </w:r>
+          </w:p>
+        </w:tc>
+        <w:tc>
+          <w:tcPr>
+            <w:tcW w:type="dxa" w:w="960"/>
+          </w:tcPr>
+          <w:p>
+            <w:r>
+              <w:t>RNDS-C-00517 V4.0</w:t>
+            </w:r>
+          </w:p>
+        </w:tc>
+        <w:tc>
+          <w:tcPr>
+            <w:tcW w:type="dxa" w:w="960"/>
+          </w:tcPr>
+          <w:p>
+            <w:r>
+              <w:t>CISPR.AVG</w:t>
+            </w:r>
+          </w:p>
+        </w:tc>
+        <w:tc>
+          <w:tcPr>
+            <w:tcW w:type="dxa" w:w="960"/>
+          </w:tcPr>
+          <w:p>
+            <w:r>
+              <w:t>-</w:t>
+            </w:r>
+          </w:p>
+        </w:tc>
+      </w:tr>
+    </w:tbl>
+    <w:p>
+      <w:pPr>
+        <w:pStyle w:val="Heading2"/>
+      </w:pPr>
+      <w:r>
+        <w:t>Configuration ER_In front of DUT RBW 9kHz_GNSS</w:t>
+      </w:r>
+    </w:p>
+    <w:p>
+      <w:r>
+        <w:t>Paramètres de test :</w:t>
+      </w:r>
+    </w:p>
+    <w:p>
+      <w:r>
+        <w:t xml:space="preserve">  • Project: CRE2-2025-TP002 RESAC</w:t>
+      </w:r>
+    </w:p>
+    <w:p>
+      <w:r>
+        <w:t xml:space="preserve">  • Operator: VA/FK, 17/02/2025 17:42:15</w:t>
+      </w:r>
+    </w:p>
+    <w:p>
+      <w:r>
+        <w:t xml:space="preserve">  • Test Configuration: Antenna position:in front of harness, DUT Orientation:axis X, Housing connected to the ground plane:no, Configuration of the power return line LV:remotely grounded, -</w:t>
+      </w:r>
+    </w:p>
+    <w:p>
+      <w:r>
+        <w:t xml:space="preserve">  • Operating mode: Mode 3, Conclusion  comply</w:t>
+      </w:r>
+    </w:p>
+    <w:tbl>
+      <w:tblPr>
+        <w:tblStyle w:val="TableGrid"/>
+        <w:tblW w:type="auto" w:w="0"/>
+        <w:tblLook w:firstColumn="1" w:firstRow="1" w:lastColumn="0" w:lastRow="0" w:noHBand="0" w:noVBand="1" w:val="04A0"/>
+      </w:tblPr>
+      <w:tblGrid>
+        <w:gridCol w:w="960"/>
+        <w:gridCol w:w="960"/>
+        <w:gridCol w:w="960"/>
+        <w:gridCol w:w="960"/>
+        <w:gridCol w:w="960"/>
+        <w:gridCol w:w="960"/>
+        <w:gridCol w:w="960"/>
+        <w:gridCol w:w="960"/>
+        <w:gridCol w:w="960"/>
+      </w:tblGrid>
+      <w:tr>
+        <w:tc>
+          <w:tcPr>
+            <w:tcW w:type="dxa" w:w="960"/>
+          </w:tcPr>
+          <w:p>
+            <w:r>
+              <w:rPr>
+                <w:b/>
+                <w:color w:val="000000"/>
+              </w:rPr>
+              <w:t>Antenna Position (Axis equipment)</w:t>
+            </w:r>
+          </w:p>
+        </w:tc>
+        <w:tc>
+          <w:tcPr>
+            <w:tcW w:type="dxa" w:w="960"/>
+          </w:tcPr>
+          <w:p>
+            <w:r>
+              <w:rPr>
+                <w:b/>
+                <w:color w:val="000000"/>
+              </w:rPr>
+              <w:t>Polarization of antenna</w:t>
+            </w:r>
+          </w:p>
+        </w:tc>
+        <w:tc>
+          <w:tcPr>
+            <w:tcW w:type="dxa" w:w="960"/>
+          </w:tcPr>
+          <w:p>
+            <w:r>
+              <w:rPr>
+                <w:b/>
+                <w:color w:val="000000"/>
+              </w:rPr>
+              <w:t>Margin (dB)</w:t>
+            </w:r>
+          </w:p>
+        </w:tc>
+        <w:tc>
+          <w:tcPr>
+            <w:tcW w:type="dxa" w:w="960"/>
+          </w:tcPr>
+          <w:p>
+            <w:r>
+              <w:rPr>
+                <w:b/>
+                <w:color w:val="000000"/>
+              </w:rPr>
+              <w:t>Overtaking (dB)</w:t>
+            </w:r>
+          </w:p>
+        </w:tc>
+        <w:tc>
+          <w:tcPr>
+            <w:tcW w:type="dxa" w:w="960"/>
+          </w:tcPr>
+          <w:p>
+            <w:r>
+              <w:rPr>
+                <w:b/>
+                <w:color w:val="000000"/>
+              </w:rPr>
+              <w:t>Conformity</w:t>
+            </w:r>
+          </w:p>
+        </w:tc>
+        <w:tc>
+          <w:tcPr>
+            <w:tcW w:type="dxa" w:w="960"/>
+          </w:tcPr>
+          <w:p>
+            <w:r>
+              <w:rPr>
+                <w:b/>
+                <w:color w:val="000000"/>
+              </w:rPr>
+              <w:t>Frequency (MHz)</w:t>
+            </w:r>
+          </w:p>
+        </w:tc>
+        <w:tc>
+          <w:tcPr>
+            <w:tcW w:type="dxa" w:w="960"/>
+          </w:tcPr>
+          <w:p>
+            <w:r>
+              <w:rPr>
+                <w:b/>
+                <w:color w:val="000000"/>
+              </w:rPr>
+              <w:t>Applied limit</w:t>
+            </w:r>
+          </w:p>
+        </w:tc>
+        <w:tc>
+          <w:tcPr>
+            <w:tcW w:type="dxa" w:w="960"/>
+          </w:tcPr>
+          <w:p>
+            <w:r>
+              <w:rPr>
+                <w:b/>
+                <w:color w:val="000000"/>
+              </w:rPr>
+              <w:t>Detector type</w:t>
+            </w:r>
+          </w:p>
+        </w:tc>
+        <w:tc>
+          <w:tcPr>
+            <w:tcW w:type="dxa" w:w="960"/>
+          </w:tcPr>
+          <w:p>
+            <w:r>
+              <w:rPr>
+                <w:b/>
+                <w:color w:val="000000"/>
+              </w:rPr>
+              <w:t>Comment</w:t>
+            </w:r>
+          </w:p>
+        </w:tc>
+      </w:tr>
+      <w:tr>
+        <w:tc>
+          <w:tcPr>
+            <w:tcW w:type="dxa" w:w="960"/>
+          </w:tcPr>
+          <w:p>
+            <w:r>
+              <w:t>1 (X)</w:t>
+            </w:r>
+          </w:p>
+        </w:tc>
+        <w:tc>
+          <w:tcPr>
+            <w:tcW w:type="dxa" w:w="960"/>
+          </w:tcPr>
+          <w:p>
+            <w:r>
+              <w:t>Vertical</w:t>
+            </w:r>
+          </w:p>
+        </w:tc>
+        <w:tc>
+          <w:tcPr>
+            <w:tcW w:type="dxa" w:w="960"/>
+          </w:tcPr>
+          <w:p>
+            <w:r>
+              <w:t>4</w:t>
+            </w:r>
+          </w:p>
+        </w:tc>
+        <w:tc>
+          <w:tcPr>
+            <w:tcW w:type="dxa" w:w="960"/>
+          </w:tcPr>
+          <w:p>
+            <w:r>
+              <w:t>-</w:t>
+            </w:r>
+          </w:p>
+        </w:tc>
+        <w:tc>
+          <w:tcPr>
+            <w:tcW w:type="dxa" w:w="960"/>
+          </w:tcPr>
+          <w:p>
+            <w:r>
+              <w:rPr>
+                <w:color w:val="008000"/>
+              </w:rPr>
+              <w:t>OK</w:t>
+            </w:r>
+          </w:p>
+        </w:tc>
+        <w:tc>
+          <w:tcPr>
+            <w:tcW w:type="dxa" w:w="960"/>
+          </w:tcPr>
+          <w:p>
+            <w:r>
+              <w:t>1175.910</w:t>
+            </w:r>
+          </w:p>
+        </w:tc>
+        <w:tc>
+          <w:tcPr>
+            <w:tcW w:type="dxa" w:w="960"/>
+          </w:tcPr>
+          <w:p>
+            <w:r>
+              <w:t>RNDS-C-00517 V4.0</w:t>
+            </w:r>
+          </w:p>
+        </w:tc>
+        <w:tc>
+          <w:tcPr>
+            <w:tcW w:type="dxa" w:w="960"/>
+          </w:tcPr>
+          <w:p>
+            <w:r>
+              <w:t>CISPR.AVG</w:t>
+            </w:r>
+          </w:p>
+        </w:tc>
+        <w:tc>
+          <w:tcPr>
+            <w:tcW w:type="dxa" w:w="960"/>
+          </w:tcPr>
+          <w:p>
+            <w:r>
+              <w:t>-</w:t>
+            </w:r>
+          </w:p>
+        </w:tc>
+      </w:tr>
+    </w:tbl>
+    <w:p>
+      <w:pPr>
+        <w:pStyle w:val="Heading2"/>
+      </w:pPr>
+      <w:r>
+        <w:t>Configuration ER_In front of DUT RBW 9kHz_GNSS</w:t>
+      </w:r>
+    </w:p>
+    <w:p>
+      <w:r>
+        <w:t>Paramètres de test :</w:t>
+      </w:r>
+    </w:p>
+    <w:p>
+      <w:r>
+        <w:t xml:space="preserve">  • Project: CRE2-2025-TP002 RESAC</w:t>
+      </w:r>
+    </w:p>
+    <w:p>
+      <w:r>
+        <w:t xml:space="preserve">  • Operator: VA/FK, 17/02/2025 17:42:15</w:t>
+      </w:r>
+    </w:p>
+    <w:p>
+      <w:r>
+        <w:t xml:space="preserve">  • Test Configuration: Antenna position:in front of harness, DUT Orientation:axis X, Housing connected to the ground plane:no, Configuration of the power return line LV:remotely grounded, -</w:t>
+      </w:r>
+    </w:p>
+    <w:p>
+      <w:r>
+        <w:t xml:space="preserve">  • Operating mode: Mode 3, Conclusion  comply</w:t>
+      </w:r>
+    </w:p>
+    <w:tbl>
+      <w:tblPr>
+        <w:tblStyle w:val="TableGrid"/>
+        <w:tblW w:type="auto" w:w="0"/>
+        <w:tblLook w:firstColumn="1" w:firstRow="1" w:lastColumn="0" w:lastRow="0" w:noHBand="0" w:noVBand="1" w:val="04A0"/>
+      </w:tblPr>
+      <w:tblGrid>
+        <w:gridCol w:w="960"/>
+        <w:gridCol w:w="960"/>
+        <w:gridCol w:w="960"/>
+        <w:gridCol w:w="960"/>
+        <w:gridCol w:w="960"/>
+        <w:gridCol w:w="960"/>
+        <w:gridCol w:w="960"/>
+        <w:gridCol w:w="960"/>
+        <w:gridCol w:w="960"/>
+      </w:tblGrid>
+      <w:tr>
+        <w:tc>
+          <w:tcPr>
+            <w:tcW w:type="dxa" w:w="960"/>
+          </w:tcPr>
+          <w:p>
+            <w:r>
+              <w:rPr>
+                <w:b/>
+                <w:color w:val="000000"/>
+              </w:rPr>
+              <w:t>Antenna Position (Axis equipment)</w:t>
+            </w:r>
+          </w:p>
+        </w:tc>
+        <w:tc>
+          <w:tcPr>
+            <w:tcW w:type="dxa" w:w="960"/>
+          </w:tcPr>
+          <w:p>
+            <w:r>
+              <w:rPr>
+                <w:b/>
+                <w:color w:val="000000"/>
+              </w:rPr>
+              <w:t>Polarization of antenna</w:t>
+            </w:r>
+          </w:p>
+        </w:tc>
+        <w:tc>
+          <w:tcPr>
+            <w:tcW w:type="dxa" w:w="960"/>
+          </w:tcPr>
+          <w:p>
+            <w:r>
+              <w:rPr>
+                <w:b/>
+                <w:color w:val="000000"/>
+              </w:rPr>
+              <w:t>Margin (dB)</w:t>
+            </w:r>
+          </w:p>
+        </w:tc>
+        <w:tc>
+          <w:tcPr>
+            <w:tcW w:type="dxa" w:w="960"/>
+          </w:tcPr>
+          <w:p>
+            <w:r>
+              <w:rPr>
+                <w:b/>
+                <w:color w:val="000000"/>
+              </w:rPr>
+              <w:t>Overtaking (dB)</w:t>
+            </w:r>
+          </w:p>
+        </w:tc>
+        <w:tc>
+          <w:tcPr>
+            <w:tcW w:type="dxa" w:w="960"/>
+          </w:tcPr>
+          <w:p>
+            <w:r>
+              <w:rPr>
+                <w:b/>
+                <w:color w:val="000000"/>
+              </w:rPr>
+              <w:t>Conformity</w:t>
+            </w:r>
+          </w:p>
+        </w:tc>
+        <w:tc>
+          <w:tcPr>
+            <w:tcW w:type="dxa" w:w="960"/>
+          </w:tcPr>
+          <w:p>
+            <w:r>
+              <w:rPr>
+                <w:b/>
+                <w:color w:val="000000"/>
+              </w:rPr>
+              <w:t>Frequency (MHz)</w:t>
+            </w:r>
+          </w:p>
+        </w:tc>
+        <w:tc>
+          <w:tcPr>
+            <w:tcW w:type="dxa" w:w="960"/>
+          </w:tcPr>
+          <w:p>
+            <w:r>
+              <w:rPr>
+                <w:b/>
+                <w:color w:val="000000"/>
+              </w:rPr>
+              <w:t>Applied limit</w:t>
+            </w:r>
+          </w:p>
+        </w:tc>
+        <w:tc>
+          <w:tcPr>
+            <w:tcW w:type="dxa" w:w="960"/>
+          </w:tcPr>
+          <w:p>
+            <w:r>
+              <w:rPr>
+                <w:b/>
+                <w:color w:val="000000"/>
+              </w:rPr>
+              <w:t>Detector type</w:t>
+            </w:r>
+          </w:p>
+        </w:tc>
+        <w:tc>
+          <w:tcPr>
+            <w:tcW w:type="dxa" w:w="960"/>
+          </w:tcPr>
+          <w:p>
+            <w:r>
+              <w:rPr>
+                <w:b/>
+                <w:color w:val="000000"/>
+              </w:rPr>
+              <w:t>Comment</w:t>
+            </w:r>
+          </w:p>
+        </w:tc>
+      </w:tr>
+      <w:tr>
+        <w:tc>
+          <w:tcPr>
+            <w:tcW w:type="dxa" w:w="960"/>
+          </w:tcPr>
+          <w:p>
+            <w:r>
+              <w:t>1 (X)</w:t>
+            </w:r>
+          </w:p>
+        </w:tc>
+        <w:tc>
+          <w:tcPr>
+            <w:tcW w:type="dxa" w:w="960"/>
+          </w:tcPr>
+          <w:p>
+            <w:r>
+              <w:t>Vertical</w:t>
+            </w:r>
+          </w:p>
+        </w:tc>
+        <w:tc>
+          <w:tcPr>
+            <w:tcW w:type="dxa" w:w="960"/>
+          </w:tcPr>
+          <w:p>
+            <w:r>
+              <w:t>4</w:t>
+            </w:r>
+          </w:p>
+        </w:tc>
+        <w:tc>
+          <w:tcPr>
+            <w:tcW w:type="dxa" w:w="960"/>
+          </w:tcPr>
+          <w:p>
+            <w:r>
+              <w:t>-</w:t>
+            </w:r>
+          </w:p>
+        </w:tc>
+        <w:tc>
+          <w:tcPr>
+            <w:tcW w:type="dxa" w:w="960"/>
+          </w:tcPr>
+          <w:p>
+            <w:r>
+              <w:rPr>
+                <w:color w:val="008000"/>
+              </w:rPr>
+              <w:t>OK</w:t>
+            </w:r>
+          </w:p>
+        </w:tc>
+        <w:tc>
+          <w:tcPr>
+            <w:tcW w:type="dxa" w:w="960"/>
+          </w:tcPr>
+          <w:p>
+            <w:r>
+              <w:t>1175.910</w:t>
+            </w:r>
+          </w:p>
+        </w:tc>
+        <w:tc>
+          <w:tcPr>
+            <w:tcW w:type="dxa" w:w="960"/>
+          </w:tcPr>
+          <w:p>
+            <w:r>
+              <w:t>RNDS-C-00517 V4.0</w:t>
+            </w:r>
+          </w:p>
+        </w:tc>
+        <w:tc>
+          <w:tcPr>
+            <w:tcW w:type="dxa" w:w="960"/>
+          </w:tcPr>
+          <w:p>
+            <w:r>
+              <w:t>CISPR.AVG</w:t>
+            </w:r>
+          </w:p>
+        </w:tc>
+        <w:tc>
+          <w:tcPr>
+            <w:tcW w:type="dxa" w:w="960"/>
+          </w:tcPr>
+          <w:p>
+            <w:r>
+              <w:t>-</w:t>
+            </w:r>
+          </w:p>
+        </w:tc>
+      </w:tr>
+    </w:tbl>
+    <w:p>
+      <w:pPr>
+        <w:pStyle w:val="Heading2"/>
+      </w:pPr>
+      <w:r>
+        <w:t>Configuration ER_In front of harness RBW 120kHz</w:t>
+      </w:r>
+    </w:p>
+    <w:p>
+      <w:r>
+        <w:t>Paramètres de test :</w:t>
+      </w:r>
+    </w:p>
+    <w:p>
+      <w:r>
+        <w:t xml:space="preserve">  • Project: CRE2-2025-TP002 RESAC</w:t>
+      </w:r>
+    </w:p>
+    <w:p>
+      <w:r>
+        <w:t xml:space="preserve">  • Operator: VA/FK, 17/02/2025 17:42:15</w:t>
+      </w:r>
+    </w:p>
+    <w:p>
+      <w:r>
+        <w:t xml:space="preserve">  • Test Configuration: Antenna position:in front of harness, DUT Orientation:axis X, Housing connected to the ground plane:no, Configuration of the power return line LV:remotely grounded, -</w:t>
+      </w:r>
+    </w:p>
+    <w:p>
+      <w:r>
+        <w:t xml:space="preserve">  • Operating mode: Mode 3, Conclusion  comply</w:t>
+      </w:r>
+    </w:p>
+    <w:tbl>
+      <w:tblPr>
+        <w:tblStyle w:val="TableGrid"/>
+        <w:tblW w:type="auto" w:w="0"/>
+        <w:tblLook w:firstColumn="1" w:firstRow="1" w:lastColumn="0" w:lastRow="0" w:noHBand="0" w:noVBand="1" w:val="04A0"/>
+      </w:tblPr>
+      <w:tblGrid>
+        <w:gridCol w:w="960"/>
+        <w:gridCol w:w="960"/>
+        <w:gridCol w:w="960"/>
+        <w:gridCol w:w="960"/>
+        <w:gridCol w:w="960"/>
+        <w:gridCol w:w="960"/>
+        <w:gridCol w:w="960"/>
+        <w:gridCol w:w="960"/>
+        <w:gridCol w:w="960"/>
+      </w:tblGrid>
+      <w:tr>
+        <w:tc>
+          <w:tcPr>
+            <w:tcW w:type="dxa" w:w="960"/>
+          </w:tcPr>
+          <w:p>
+            <w:r>
+              <w:rPr>
+                <w:b/>
+                <w:color w:val="000000"/>
+              </w:rPr>
+              <w:t>Antenna Position (Axis equipment)</w:t>
+            </w:r>
+          </w:p>
+        </w:tc>
+        <w:tc>
+          <w:tcPr>
+            <w:tcW w:type="dxa" w:w="960"/>
+          </w:tcPr>
+          <w:p>
+            <w:r>
+              <w:rPr>
+                <w:b/>
+                <w:color w:val="000000"/>
+              </w:rPr>
+              <w:t>Polarization of antenna</w:t>
+            </w:r>
+          </w:p>
+        </w:tc>
+        <w:tc>
+          <w:tcPr>
+            <w:tcW w:type="dxa" w:w="960"/>
+          </w:tcPr>
+          <w:p>
+            <w:r>
+              <w:rPr>
+                <w:b/>
+                <w:color w:val="000000"/>
+              </w:rPr>
+              <w:t>Margin (dB)</w:t>
+            </w:r>
+          </w:p>
+        </w:tc>
+        <w:tc>
+          <w:tcPr>
+            <w:tcW w:type="dxa" w:w="960"/>
+          </w:tcPr>
+          <w:p>
+            <w:r>
+              <w:rPr>
+                <w:b/>
+                <w:color w:val="000000"/>
+              </w:rPr>
+              <w:t>Overtaking (dB)</w:t>
+            </w:r>
+          </w:p>
+        </w:tc>
+        <w:tc>
+          <w:tcPr>
+            <w:tcW w:type="dxa" w:w="960"/>
+          </w:tcPr>
+          <w:p>
+            <w:r>
+              <w:rPr>
+                <w:b/>
+                <w:color w:val="000000"/>
+              </w:rPr>
+              <w:t>Conformity</w:t>
+            </w:r>
+          </w:p>
+        </w:tc>
+        <w:tc>
+          <w:tcPr>
+            <w:tcW w:type="dxa" w:w="960"/>
+          </w:tcPr>
+          <w:p>
+            <w:r>
+              <w:rPr>
+                <w:b/>
+                <w:color w:val="000000"/>
+              </w:rPr>
+              <w:t>Frequency (MHz)</w:t>
+            </w:r>
+          </w:p>
+        </w:tc>
+        <w:tc>
+          <w:tcPr>
+            <w:tcW w:type="dxa" w:w="960"/>
+          </w:tcPr>
+          <w:p>
+            <w:r>
+              <w:rPr>
+                <w:b/>
+                <w:color w:val="000000"/>
+              </w:rPr>
+              <w:t>Applied limit</w:t>
+            </w:r>
+          </w:p>
+        </w:tc>
+        <w:tc>
+          <w:tcPr>
+            <w:tcW w:type="dxa" w:w="960"/>
+          </w:tcPr>
+          <w:p>
+            <w:r>
+              <w:rPr>
+                <w:b/>
+                <w:color w:val="000000"/>
+              </w:rPr>
+              <w:t>Detector type</w:t>
+            </w:r>
+          </w:p>
+        </w:tc>
+        <w:tc>
+          <w:tcPr>
+            <w:tcW w:type="dxa" w:w="960"/>
+          </w:tcPr>
+          <w:p>
+            <w:r>
+              <w:rPr>
+                <w:b/>
+                <w:color w:val="000000"/>
+              </w:rPr>
+              <w:t>Comment</w:t>
+            </w:r>
+          </w:p>
+        </w:tc>
+      </w:tr>
+      <w:tr>
+        <w:tc>
+          <w:tcPr>
+            <w:tcW w:type="dxa" w:w="960"/>
+          </w:tcPr>
+          <w:p>
+            <w:r>
+              <w:t>1 (X)</w:t>
+            </w:r>
+          </w:p>
+        </w:tc>
+        <w:tc>
+          <w:tcPr>
+            <w:tcW w:type="dxa" w:w="960"/>
+          </w:tcPr>
+          <w:p>
+            <w:r>
+              <w:t>Vertical</w:t>
+            </w:r>
+          </w:p>
+        </w:tc>
+        <w:tc>
+          <w:tcPr>
+            <w:tcW w:type="dxa" w:w="960"/>
+          </w:tcPr>
+          <w:p>
+            <w:r>
+              <w:t>4</w:t>
+            </w:r>
+          </w:p>
+        </w:tc>
+        <w:tc>
+          <w:tcPr>
+            <w:tcW w:type="dxa" w:w="960"/>
+          </w:tcPr>
+          <w:p>
+            <w:r>
+              <w:t>-</w:t>
+            </w:r>
+          </w:p>
+        </w:tc>
+        <w:tc>
+          <w:tcPr>
+            <w:tcW w:type="dxa" w:w="960"/>
+          </w:tcPr>
+          <w:p>
+            <w:r>
+              <w:rPr>
+                <w:color w:val="008000"/>
+              </w:rPr>
+              <w:t>OK</w:t>
+            </w:r>
+          </w:p>
+        </w:tc>
+        <w:tc>
+          <w:tcPr>
+            <w:tcW w:type="dxa" w:w="960"/>
+          </w:tcPr>
+          <w:p>
+            <w:r>
+              <w:t>432.020</w:t>
+            </w:r>
+          </w:p>
+        </w:tc>
+        <w:tc>
+          <w:tcPr>
+            <w:tcW w:type="dxa" w:w="960"/>
+          </w:tcPr>
+          <w:p>
+            <w:r>
+              <w:t>RNDS-C-00517 V4.0</w:t>
+            </w:r>
+          </w:p>
+        </w:tc>
+        <w:tc>
+          <w:tcPr>
+            <w:tcW w:type="dxa" w:w="960"/>
+          </w:tcPr>
+          <w:p>
+            <w:r>
+              <w:t>Pk</w:t>
+            </w:r>
+          </w:p>
+        </w:tc>
+        <w:tc>
+          <w:tcPr>
+            <w:tcW w:type="dxa" w:w="960"/>
+          </w:tcPr>
+          <w:p>
+            <w:r>
+              <w:t>-</w:t>
+            </w:r>
+          </w:p>
+        </w:tc>
+      </w:tr>
+      <w:tr>
+        <w:tc>
+          <w:tcPr>
+            <w:tcW w:type="dxa" w:w="960"/>
+          </w:tcPr>
+          <w:p>
+            <w:r/>
+          </w:p>
+        </w:tc>
+        <w:tc>
+          <w:tcPr>
+            <w:tcW w:type="dxa" w:w="960"/>
+          </w:tcPr>
+          <w:p>
+            <w:r/>
+          </w:p>
+        </w:tc>
+        <w:tc>
+          <w:tcPr>
+            <w:tcW w:type="dxa" w:w="960"/>
+          </w:tcPr>
+          <w:p>
+            <w:r>
+              <w:t>7</w:t>
+            </w:r>
+          </w:p>
+        </w:tc>
+        <w:tc>
+          <w:tcPr>
+            <w:tcW w:type="dxa" w:w="960"/>
+          </w:tcPr>
+          <w:p>
+            <w:r>
+              <w:t>-</w:t>
+            </w:r>
+          </w:p>
+        </w:tc>
+        <w:tc>
+          <w:tcPr>
+            <w:tcW w:type="dxa" w:w="960"/>
+          </w:tcPr>
+          <w:p>
+            <w:r/>
+          </w:p>
+        </w:tc>
+        <w:tc>
+          <w:tcPr>
+            <w:tcW w:type="dxa" w:w="960"/>
+          </w:tcPr>
+          <w:p>
+            <w:r>
+              <w:t>174.660</w:t>
+            </w:r>
+          </w:p>
+        </w:tc>
+        <w:tc>
+          <w:tcPr>
+            <w:tcW w:type="dxa" w:w="960"/>
+          </w:tcPr>
+          <w:p>
+            <w:r/>
+          </w:p>
+        </w:tc>
+        <w:tc>
+          <w:tcPr>
+            <w:tcW w:type="dxa" w:w="960"/>
+          </w:tcPr>
+          <w:p>
+            <w:r>
+              <w:t>QPk</w:t>
+            </w:r>
+          </w:p>
+        </w:tc>
+        <w:tc>
+          <w:tcPr>
+            <w:tcW w:type="dxa" w:w="960"/>
+          </w:tcPr>
+          <w:p>
+            <w:r/>
+          </w:p>
+        </w:tc>
+      </w:tr>
+      <w:tr>
+        <w:tc>
+          <w:tcPr>
+            <w:tcW w:type="dxa" w:w="960"/>
+          </w:tcPr>
+          <w:p>
+            <w:r/>
+          </w:p>
+        </w:tc>
+        <w:tc>
+          <w:tcPr>
+            <w:tcW w:type="dxa" w:w="960"/>
+          </w:tcPr>
+          <w:p>
+            <w:r/>
+          </w:p>
+        </w:tc>
+        <w:tc>
+          <w:tcPr>
+            <w:tcW w:type="dxa" w:w="960"/>
+          </w:tcPr>
+          <w:p>
+            <w:r>
+              <w:t>5</w:t>
+            </w:r>
+          </w:p>
+        </w:tc>
+        <w:tc>
+          <w:tcPr>
+            <w:tcW w:type="dxa" w:w="960"/>
+          </w:tcPr>
+          <w:p>
+            <w:r>
+              <w:t>-</w:t>
+            </w:r>
+          </w:p>
+        </w:tc>
+        <w:tc>
+          <w:tcPr>
+            <w:tcW w:type="dxa" w:w="960"/>
+          </w:tcPr>
+          <w:p>
+            <w:r/>
+          </w:p>
+        </w:tc>
+        <w:tc>
+          <w:tcPr>
+            <w:tcW w:type="dxa" w:w="960"/>
+          </w:tcPr>
+          <w:p>
+            <w:r>
+              <w:t>174.900</w:t>
+            </w:r>
+          </w:p>
+        </w:tc>
+        <w:tc>
+          <w:tcPr>
+            <w:tcW w:type="dxa" w:w="960"/>
+          </w:tcPr>
+          <w:p>
+            <w:r/>
+          </w:p>
+        </w:tc>
+        <w:tc>
+          <w:tcPr>
+            <w:tcW w:type="dxa" w:w="960"/>
+          </w:tcPr>
+          <w:p>
+            <w:r>
+              <w:t>CISPR.AVG</w:t>
+            </w:r>
+          </w:p>
+        </w:tc>
+        <w:tc>
+          <w:tcPr>
+            <w:tcW w:type="dxa" w:w="960"/>
+          </w:tcPr>
+          <w:p>
+            <w:r/>
+          </w:p>
+        </w:tc>
+      </w:tr>
+    </w:tbl>
+    <w:p>
+      <w:pPr>
+        <w:pStyle w:val="Heading2"/>
+      </w:pPr>
+      <w:r>
+        <w:t>Configuration ER_In front of harness RBW 1MHz</w:t>
+      </w:r>
+    </w:p>
+    <w:p>
+      <w:r>
+        <w:t>Paramètres de test :</w:t>
+      </w:r>
+    </w:p>
+    <w:p>
+      <w:r>
+        <w:t xml:space="preserve">  • Project: CRE2-2025-TP002 RESAC</w:t>
+      </w:r>
+    </w:p>
+    <w:p>
+      <w:r>
+        <w:t xml:space="preserve">  • Operator: VA/FK, 17/02/2025 17:42:15</w:t>
+      </w:r>
+    </w:p>
+    <w:p>
+      <w:r>
+        <w:t xml:space="preserve">  • Test Configuration: Antenna position:in front of harness, DUT Orientation:axis X, Housing connected to the ground plane:no, Configuration of the power return line LV:remotely grounded, -</w:t>
+      </w:r>
+    </w:p>
+    <w:p>
+      <w:r>
+        <w:t xml:space="preserve">  • Operating mode: Mode 3, Conclusion  comply</w:t>
+      </w:r>
+    </w:p>
+    <w:tbl>
+      <w:tblPr>
+        <w:tblStyle w:val="TableGrid"/>
+        <w:tblW w:type="auto" w:w="0"/>
+        <w:tblLook w:firstColumn="1" w:firstRow="1" w:lastColumn="0" w:lastRow="0" w:noHBand="0" w:noVBand="1" w:val="04A0"/>
+      </w:tblPr>
+      <w:tblGrid>
+        <w:gridCol w:w="960"/>
+        <w:gridCol w:w="960"/>
+        <w:gridCol w:w="960"/>
+        <w:gridCol w:w="960"/>
+        <w:gridCol w:w="960"/>
+        <w:gridCol w:w="960"/>
+        <w:gridCol w:w="960"/>
+        <w:gridCol w:w="960"/>
+        <w:gridCol w:w="960"/>
+      </w:tblGrid>
+      <w:tr>
+        <w:tc>
+          <w:tcPr>
+            <w:tcW w:type="dxa" w:w="960"/>
+          </w:tcPr>
+          <w:p>
+            <w:r>
+              <w:rPr>
+                <w:b/>
+                <w:color w:val="000000"/>
+              </w:rPr>
+              <w:t>Antenna Position (Axis equipment)</w:t>
+            </w:r>
+          </w:p>
+        </w:tc>
+        <w:tc>
+          <w:tcPr>
+            <w:tcW w:type="dxa" w:w="960"/>
+          </w:tcPr>
+          <w:p>
+            <w:r>
+              <w:rPr>
+                <w:b/>
+                <w:color w:val="000000"/>
+              </w:rPr>
+              <w:t>Polarization of antenna</w:t>
+            </w:r>
+          </w:p>
+        </w:tc>
+        <w:tc>
+          <w:tcPr>
+            <w:tcW w:type="dxa" w:w="960"/>
+          </w:tcPr>
+          <w:p>
+            <w:r>
+              <w:rPr>
+                <w:b/>
+                <w:color w:val="000000"/>
+              </w:rPr>
+              <w:t>Margin (dB)</w:t>
+            </w:r>
+          </w:p>
+        </w:tc>
+        <w:tc>
+          <w:tcPr>
+            <w:tcW w:type="dxa" w:w="960"/>
+          </w:tcPr>
+          <w:p>
+            <w:r>
+              <w:rPr>
+                <w:b/>
+                <w:color w:val="000000"/>
+              </w:rPr>
+              <w:t>Overtaking (dB)</w:t>
+            </w:r>
+          </w:p>
+        </w:tc>
+        <w:tc>
+          <w:tcPr>
+            <w:tcW w:type="dxa" w:w="960"/>
+          </w:tcPr>
+          <w:p>
+            <w:r>
+              <w:rPr>
+                <w:b/>
+                <w:color w:val="000000"/>
+              </w:rPr>
+              <w:t>Conformity</w:t>
+            </w:r>
+          </w:p>
+        </w:tc>
+        <w:tc>
+          <w:tcPr>
+            <w:tcW w:type="dxa" w:w="960"/>
+          </w:tcPr>
+          <w:p>
+            <w:r>
+              <w:rPr>
+                <w:b/>
+                <w:color w:val="000000"/>
+              </w:rPr>
+              <w:t>Frequency (MHz)</w:t>
+            </w:r>
+          </w:p>
+        </w:tc>
+        <w:tc>
+          <w:tcPr>
+            <w:tcW w:type="dxa" w:w="960"/>
+          </w:tcPr>
+          <w:p>
+            <w:r>
+              <w:rPr>
+                <w:b/>
+                <w:color w:val="000000"/>
+              </w:rPr>
+              <w:t>Applied limit</w:t>
+            </w:r>
+          </w:p>
+        </w:tc>
+        <w:tc>
+          <w:tcPr>
+            <w:tcW w:type="dxa" w:w="960"/>
+          </w:tcPr>
+          <w:p>
+            <w:r>
+              <w:rPr>
+                <w:b/>
+                <w:color w:val="000000"/>
+              </w:rPr>
+              <w:t>Detector type</w:t>
+            </w:r>
+          </w:p>
+        </w:tc>
+        <w:tc>
+          <w:tcPr>
+            <w:tcW w:type="dxa" w:w="960"/>
+          </w:tcPr>
+          <w:p>
+            <w:r>
+              <w:rPr>
+                <w:b/>
+                <w:color w:val="000000"/>
+              </w:rPr>
+              <w:t>Comment</w:t>
+            </w:r>
+          </w:p>
+        </w:tc>
+      </w:tr>
+      <w:tr>
+        <w:tc>
+          <w:tcPr>
+            <w:tcW w:type="dxa" w:w="960"/>
+          </w:tcPr>
+          <w:p>
+            <w:r>
+              <w:t>1 (X)</w:t>
+            </w:r>
+          </w:p>
+        </w:tc>
+        <w:tc>
+          <w:tcPr>
+            <w:tcW w:type="dxa" w:w="960"/>
+          </w:tcPr>
+          <w:p>
+            <w:r>
+              <w:t>Vertical</w:t>
+            </w:r>
+          </w:p>
+        </w:tc>
+        <w:tc>
+          <w:tcPr>
+            <w:tcW w:type="dxa" w:w="960"/>
+          </w:tcPr>
+          <w:p>
+            <w:r>
+              <w:t>4</w:t>
+            </w:r>
+          </w:p>
+        </w:tc>
+        <w:tc>
+          <w:tcPr>
+            <w:tcW w:type="dxa" w:w="960"/>
+          </w:tcPr>
+          <w:p>
+            <w:r>
+              <w:t>-</w:t>
+            </w:r>
+          </w:p>
+        </w:tc>
+        <w:tc>
+          <w:tcPr>
+            <w:tcW w:type="dxa" w:w="960"/>
+          </w:tcPr>
+          <w:p>
+            <w:r>
+              <w:rPr>
+                <w:color w:val="008000"/>
+              </w:rPr>
+              <w:t>OK</w:t>
+            </w:r>
+          </w:p>
+        </w:tc>
+        <w:tc>
+          <w:tcPr>
+            <w:tcW w:type="dxa" w:w="960"/>
+          </w:tcPr>
+          <w:p>
+            <w:r>
+              <w:t>239.000</w:t>
+            </w:r>
+          </w:p>
+        </w:tc>
+        <w:tc>
+          <w:tcPr>
+            <w:tcW w:type="dxa" w:w="960"/>
+          </w:tcPr>
+          <w:p>
+            <w:r>
+              <w:t>RNDS-C-00517 V4.0</w:t>
+            </w:r>
+          </w:p>
+        </w:tc>
+        <w:tc>
+          <w:tcPr>
+            <w:tcW w:type="dxa" w:w="960"/>
+          </w:tcPr>
+          <w:p>
+            <w:r>
+              <w:t>Pk</w:t>
+            </w:r>
+          </w:p>
+        </w:tc>
+        <w:tc>
+          <w:tcPr>
+            <w:tcW w:type="dxa" w:w="960"/>
+          </w:tcPr>
+          <w:p>
+            <w:r>
+              <w:t>-</w:t>
+            </w:r>
+          </w:p>
+        </w:tc>
+      </w:tr>
+      <w:tr>
+        <w:tc>
+          <w:tcPr>
+            <w:tcW w:type="dxa" w:w="960"/>
+          </w:tcPr>
+          <w:p>
+            <w:r/>
+          </w:p>
+        </w:tc>
+        <w:tc>
+          <w:tcPr>
+            <w:tcW w:type="dxa" w:w="960"/>
+          </w:tcPr>
+          <w:p>
+            <w:r/>
+          </w:p>
+        </w:tc>
+        <w:tc>
+          <w:tcPr>
+            <w:tcW w:type="dxa" w:w="960"/>
+          </w:tcPr>
+          <w:p>
+            <w:r>
+              <w:t>4</w:t>
+            </w:r>
+          </w:p>
+        </w:tc>
+        <w:tc>
+          <w:tcPr>
+            <w:tcW w:type="dxa" w:w="960"/>
+          </w:tcPr>
+          <w:p>
+            <w:r>
+              <w:t>-</w:t>
+            </w:r>
+          </w:p>
+        </w:tc>
+        <w:tc>
+          <w:tcPr>
+            <w:tcW w:type="dxa" w:w="960"/>
+          </w:tcPr>
+          <w:p>
+            <w:r/>
+          </w:p>
+        </w:tc>
+        <w:tc>
+          <w:tcPr>
+            <w:tcW w:type="dxa" w:w="960"/>
+          </w:tcPr>
+          <w:p>
+            <w:r>
+              <w:t>514.500</w:t>
+            </w:r>
+          </w:p>
+        </w:tc>
+        <w:tc>
+          <w:tcPr>
+            <w:tcW w:type="dxa" w:w="960"/>
+          </w:tcPr>
+          <w:p>
+            <w:r/>
+          </w:p>
+        </w:tc>
+        <w:tc>
+          <w:tcPr>
+            <w:tcW w:type="dxa" w:w="960"/>
+          </w:tcPr>
+          <w:p>
+            <w:r>
+              <w:t>CISPR.AVG</w:t>
+            </w:r>
+          </w:p>
+        </w:tc>
+        <w:tc>
+          <w:tcPr>
+            <w:tcW w:type="dxa" w:w="960"/>
+          </w:tcPr>
+          <w:p>
+            <w:r/>
+          </w:p>
+        </w:tc>
+      </w:tr>
+    </w:tbl>
+    <w:p>
+      <w:pPr>
+        <w:pStyle w:val="Heading2"/>
+      </w:pPr>
+      <w:r>
+        <w:t>Configuration ER_In front of harness RBW 9kHz</w:t>
+      </w:r>
+    </w:p>
+    <w:p>
+      <w:r>
+        <w:t>Paramètres de test :</w:t>
+      </w:r>
+    </w:p>
+    <w:p>
+      <w:r>
+        <w:t xml:space="preserve">  • Project: CRE2-2025-TP002 RESAC</w:t>
+      </w:r>
+    </w:p>
+    <w:p>
+      <w:r>
+        <w:t xml:space="preserve">  • Operator: VA/FK, 17/02/2025 17:42:15</w:t>
+      </w:r>
+    </w:p>
+    <w:p>
+      <w:r>
+        <w:t xml:space="preserve">  • Test Configuration: Antenna position:in front of harness, DUT Orientation:axis X, Housing connected to the ground plane:no, Configuration of the power return line LV:remotely grounded, -</w:t>
+      </w:r>
+    </w:p>
+    <w:p>
+      <w:r>
+        <w:t xml:space="preserve">  • Operating mode: Mode 3, Conclusion  comply</w:t>
+      </w:r>
+    </w:p>
+    <w:tbl>
+      <w:tblPr>
+        <w:tblStyle w:val="TableGrid"/>
+        <w:tblW w:type="auto" w:w="0"/>
+        <w:tblLook w:firstColumn="1" w:firstRow="1" w:lastColumn="0" w:lastRow="0" w:noHBand="0" w:noVBand="1" w:val="04A0"/>
+      </w:tblPr>
+      <w:tblGrid>
+        <w:gridCol w:w="960"/>
+        <w:gridCol w:w="960"/>
+        <w:gridCol w:w="960"/>
+        <w:gridCol w:w="960"/>
+        <w:gridCol w:w="960"/>
+        <w:gridCol w:w="960"/>
+        <w:gridCol w:w="960"/>
+        <w:gridCol w:w="960"/>
+        <w:gridCol w:w="960"/>
+      </w:tblGrid>
+      <w:tr>
+        <w:tc>
+          <w:tcPr>
+            <w:tcW w:type="dxa" w:w="960"/>
+          </w:tcPr>
+          <w:p>
+            <w:r>
+              <w:rPr>
+                <w:b/>
+                <w:color w:val="000000"/>
+              </w:rPr>
+              <w:t>Antenna Position (Axis equipment)</w:t>
+            </w:r>
+          </w:p>
+        </w:tc>
+        <w:tc>
+          <w:tcPr>
+            <w:tcW w:type="dxa" w:w="960"/>
+          </w:tcPr>
+          <w:p>
+            <w:r>
+              <w:rPr>
+                <w:b/>
+                <w:color w:val="000000"/>
+              </w:rPr>
+              <w:t>Polarization of antenna</w:t>
+            </w:r>
+          </w:p>
+        </w:tc>
+        <w:tc>
+          <w:tcPr>
+            <w:tcW w:type="dxa" w:w="960"/>
+          </w:tcPr>
+          <w:p>
+            <w:r>
+              <w:rPr>
+                <w:b/>
+                <w:color w:val="000000"/>
+              </w:rPr>
+              <w:t>Margin (dB)</w:t>
+            </w:r>
+          </w:p>
+        </w:tc>
+        <w:tc>
+          <w:tcPr>
+            <w:tcW w:type="dxa" w:w="960"/>
+          </w:tcPr>
+          <w:p>
+            <w:r>
+              <w:rPr>
+                <w:b/>
+                <w:color w:val="000000"/>
+              </w:rPr>
+              <w:t>Overtaking (dB)</w:t>
+            </w:r>
+          </w:p>
+        </w:tc>
+        <w:tc>
+          <w:tcPr>
+            <w:tcW w:type="dxa" w:w="960"/>
+          </w:tcPr>
+          <w:p>
+            <w:r>
+              <w:rPr>
+                <w:b/>
+                <w:color w:val="000000"/>
+              </w:rPr>
+              <w:t>Conformity</w:t>
+            </w:r>
+          </w:p>
+        </w:tc>
+        <w:tc>
+          <w:tcPr>
+            <w:tcW w:type="dxa" w:w="960"/>
+          </w:tcPr>
+          <w:p>
+            <w:r>
+              <w:rPr>
+                <w:b/>
+                <w:color w:val="000000"/>
+              </w:rPr>
+              <w:t>Frequency (MHz)</w:t>
+            </w:r>
+          </w:p>
+        </w:tc>
+        <w:tc>
+          <w:tcPr>
+            <w:tcW w:type="dxa" w:w="960"/>
+          </w:tcPr>
+          <w:p>
+            <w:r>
+              <w:rPr>
+                <w:b/>
+                <w:color w:val="000000"/>
+              </w:rPr>
+              <w:t>Applied limit</w:t>
+            </w:r>
+          </w:p>
+        </w:tc>
+        <w:tc>
+          <w:tcPr>
+            <w:tcW w:type="dxa" w:w="960"/>
+          </w:tcPr>
+          <w:p>
+            <w:r>
+              <w:rPr>
+                <w:b/>
+                <w:color w:val="000000"/>
+              </w:rPr>
+              <w:t>Detector type</w:t>
+            </w:r>
+          </w:p>
+        </w:tc>
+        <w:tc>
+          <w:tcPr>
+            <w:tcW w:type="dxa" w:w="960"/>
+          </w:tcPr>
+          <w:p>
+            <w:r>
+              <w:rPr>
+                <w:b/>
+                <w:color w:val="000000"/>
+              </w:rPr>
+              <w:t>Comment</w:t>
+            </w:r>
+          </w:p>
+        </w:tc>
+      </w:tr>
+      <w:tr>
+        <w:tc>
+          <w:tcPr>
+            <w:tcW w:type="dxa" w:w="960"/>
+          </w:tcPr>
+          <w:p>
+            <w:r>
+              <w:t>1 (X)</w:t>
+            </w:r>
+          </w:p>
+        </w:tc>
+        <w:tc>
+          <w:tcPr>
+            <w:tcW w:type="dxa" w:w="960"/>
+          </w:tcPr>
+          <w:p>
+            <w:r>
+              <w:t>Vertical</w:t>
+            </w:r>
+          </w:p>
+        </w:tc>
+        <w:tc>
+          <w:tcPr>
+            <w:tcW w:type="dxa" w:w="960"/>
+          </w:tcPr>
+          <w:p>
+            <w:r>
+              <w:t>30</w:t>
+            </w:r>
+          </w:p>
+        </w:tc>
+        <w:tc>
+          <w:tcPr>
+            <w:tcW w:type="dxa" w:w="960"/>
+          </w:tcPr>
+          <w:p>
+            <w:r>
+              <w:t>-</w:t>
+            </w:r>
+          </w:p>
+        </w:tc>
+        <w:tc>
+          <w:tcPr>
+            <w:tcW w:type="dxa" w:w="960"/>
+          </w:tcPr>
+          <w:p>
+            <w:r>
+              <w:rPr>
+                <w:color w:val="008000"/>
+              </w:rPr>
+              <w:t>OK</w:t>
+            </w:r>
+          </w:p>
+        </w:tc>
+        <w:tc>
+          <w:tcPr>
+            <w:tcW w:type="dxa" w:w="960"/>
+          </w:tcPr>
+          <w:p>
+            <w:r>
+              <w:t>1.26775</w:t>
+            </w:r>
+          </w:p>
+        </w:tc>
+        <w:tc>
+          <w:tcPr>
+            <w:tcW w:type="dxa" w:w="960"/>
+          </w:tcPr>
+          <w:p>
+            <w:r>
+              <w:t>RNDS-C-00517 V4.0</w:t>
+            </w:r>
+          </w:p>
+        </w:tc>
+        <w:tc>
+          <w:tcPr>
+            <w:tcW w:type="dxa" w:w="960"/>
+          </w:tcPr>
+          <w:p>
+            <w:r>
+              <w:t>Pk</w:t>
+            </w:r>
+          </w:p>
+        </w:tc>
+        <w:tc>
+          <w:tcPr>
+            <w:tcW w:type="dxa" w:w="960"/>
+          </w:tcPr>
+          <w:p>
+            <w:r>
+              <w:t>-</w:t>
+            </w:r>
+          </w:p>
+        </w:tc>
+      </w:tr>
+      <w:tr>
+        <w:tc>
+          <w:tcPr>
+            <w:tcW w:type="dxa" w:w="960"/>
+          </w:tcPr>
+          <w:p>
+            <w:r/>
+          </w:p>
+        </w:tc>
+        <w:tc>
+          <w:tcPr>
+            <w:tcW w:type="dxa" w:w="960"/>
+          </w:tcPr>
+          <w:p>
+            <w:r/>
+          </w:p>
+        </w:tc>
+        <w:tc>
+          <w:tcPr>
+            <w:tcW w:type="dxa" w:w="960"/>
+          </w:tcPr>
+          <w:p>
+            <w:r>
+              <w:t>19</w:t>
+            </w:r>
+          </w:p>
+        </w:tc>
+        <w:tc>
+          <w:tcPr>
+            <w:tcW w:type="dxa" w:w="960"/>
+          </w:tcPr>
+          <w:p>
+            <w:r>
+              <w:t>-</w:t>
+            </w:r>
+          </w:p>
+        </w:tc>
+        <w:tc>
+          <w:tcPr>
+            <w:tcW w:type="dxa" w:w="960"/>
+          </w:tcPr>
+          <w:p>
+            <w:r/>
+          </w:p>
+        </w:tc>
+        <w:tc>
+          <w:tcPr>
+            <w:tcW w:type="dxa" w:w="960"/>
+          </w:tcPr>
+          <w:p>
+            <w:r>
+              <w:t>1.26775</w:t>
+            </w:r>
+          </w:p>
+        </w:tc>
+        <w:tc>
+          <w:tcPr>
+            <w:tcW w:type="dxa" w:w="960"/>
+          </w:tcPr>
+          <w:p>
+            <w:r/>
+          </w:p>
+        </w:tc>
+        <w:tc>
+          <w:tcPr>
+            <w:tcW w:type="dxa" w:w="960"/>
+          </w:tcPr>
+          <w:p>
+            <w:r>
+              <w:t>QPk</w:t>
+            </w:r>
+          </w:p>
+        </w:tc>
+        <w:tc>
+          <w:tcPr>
+            <w:tcW w:type="dxa" w:w="960"/>
+          </w:tcPr>
+          <w:p>
+            <w:r/>
+          </w:p>
+        </w:tc>
+      </w:tr>
+      <w:tr>
+        <w:tc>
+          <w:tcPr>
+            <w:tcW w:type="dxa" w:w="960"/>
+          </w:tcPr>
+          <w:p>
+            <w:r/>
+          </w:p>
+        </w:tc>
+        <w:tc>
+          <w:tcPr>
+            <w:tcW w:type="dxa" w:w="960"/>
+          </w:tcPr>
+          <w:p>
+            <w:r/>
+          </w:p>
+        </w:tc>
+        <w:tc>
+          <w:tcPr>
+            <w:tcW w:type="dxa" w:w="960"/>
+          </w:tcPr>
+          <w:p>
+            <w:r>
+              <w:t>22</w:t>
+            </w:r>
+          </w:p>
+        </w:tc>
+        <w:tc>
+          <w:tcPr>
+            <w:tcW w:type="dxa" w:w="960"/>
+          </w:tcPr>
+          <w:p>
+            <w:r>
+              <w:t>-</w:t>
+            </w:r>
+          </w:p>
+        </w:tc>
+        <w:tc>
+          <w:tcPr>
+            <w:tcW w:type="dxa" w:w="960"/>
+          </w:tcPr>
+          <w:p>
+            <w:r/>
+          </w:p>
+        </w:tc>
+        <w:tc>
+          <w:tcPr>
+            <w:tcW w:type="dxa" w:w="960"/>
+          </w:tcPr>
+          <w:p>
+            <w:r>
+              <w:t>26.639</w:t>
+            </w:r>
+          </w:p>
+        </w:tc>
+        <w:tc>
+          <w:tcPr>
+            <w:tcW w:type="dxa" w:w="960"/>
+          </w:tcPr>
+          <w:p>
+            <w:r/>
+          </w:p>
+        </w:tc>
+        <w:tc>
+          <w:tcPr>
+            <w:tcW w:type="dxa" w:w="960"/>
+          </w:tcPr>
+          <w:p>
+            <w:r>
+              <w:t>CISPR.AVG</w:t>
+            </w:r>
+          </w:p>
+        </w:tc>
+        <w:tc>
+          <w:tcPr>
+            <w:tcW w:type="dxa" w:w="960"/>
+          </w:tcPr>
+          <w:p>
+            <w:r/>
+          </w:p>
+        </w:tc>
+      </w:tr>
+    </w:tbl>
+    <w:p>
+      <w:pPr>
+        <w:pStyle w:val="Heading2"/>
+      </w:pPr>
+      <w:r>
+        <w:t>Configuration ER_In front of harness RBW 9kHz_GNSS</w:t>
+      </w:r>
+    </w:p>
+    <w:p>
+      <w:r>
+        <w:t>Paramètres de test :</w:t>
+      </w:r>
+    </w:p>
+    <w:p>
+      <w:r>
+        <w:t xml:space="preserve">  • Project: CRE2-2025-TP002 RESAC</w:t>
+      </w:r>
+    </w:p>
+    <w:p>
+      <w:r>
+        <w:t xml:space="preserve">  • Operator: VA/FK, 17/02/2025 17:42:15</w:t>
+      </w:r>
+    </w:p>
+    <w:p>
+      <w:r>
+        <w:t xml:space="preserve">  • Test Configuration: Antenna position:in front of harness, DUT Orientation:axis X, Housing connected to the ground plane:no, Configuration of the power return line LV:remotely grounded, -</w:t>
+      </w:r>
+    </w:p>
+    <w:p>
+      <w:r>
+        <w:t xml:space="preserve">  • Operating mode: Mode 3, Conclusion  comply</w:t>
+      </w:r>
+    </w:p>
+    <w:tbl>
+      <w:tblPr>
+        <w:tblStyle w:val="TableGrid"/>
+        <w:tblW w:type="auto" w:w="0"/>
+        <w:tblLook w:firstColumn="1" w:firstRow="1" w:lastColumn="0" w:lastRow="0" w:noHBand="0" w:noVBand="1" w:val="04A0"/>
+      </w:tblPr>
+      <w:tblGrid>
+        <w:gridCol w:w="960"/>
+        <w:gridCol w:w="960"/>
+        <w:gridCol w:w="960"/>
+        <w:gridCol w:w="960"/>
+        <w:gridCol w:w="960"/>
+        <w:gridCol w:w="960"/>
+        <w:gridCol w:w="960"/>
+        <w:gridCol w:w="960"/>
+        <w:gridCol w:w="960"/>
+      </w:tblGrid>
+      <w:tr>
+        <w:tc>
+          <w:tcPr>
+            <w:tcW w:type="dxa" w:w="960"/>
+          </w:tcPr>
+          <w:p>
+            <w:r>
+              <w:rPr>
+                <w:b/>
+                <w:color w:val="000000"/>
+              </w:rPr>
+              <w:t>Antenna Position (Axis equipment)</w:t>
+            </w:r>
+          </w:p>
+        </w:tc>
+        <w:tc>
+          <w:tcPr>
+            <w:tcW w:type="dxa" w:w="960"/>
+          </w:tcPr>
+          <w:p>
+            <w:r>
+              <w:rPr>
+                <w:b/>
+                <w:color w:val="000000"/>
+              </w:rPr>
+              <w:t>Polarization of antenna</w:t>
+            </w:r>
+          </w:p>
+        </w:tc>
+        <w:tc>
+          <w:tcPr>
+            <w:tcW w:type="dxa" w:w="960"/>
+          </w:tcPr>
+          <w:p>
+            <w:r>
+              <w:rPr>
+                <w:b/>
+                <w:color w:val="000000"/>
+              </w:rPr>
+              <w:t>Margin (dB)</w:t>
+            </w:r>
+          </w:p>
+        </w:tc>
+        <w:tc>
+          <w:tcPr>
+            <w:tcW w:type="dxa" w:w="960"/>
+          </w:tcPr>
+          <w:p>
+            <w:r>
+              <w:rPr>
+                <w:b/>
+                <w:color w:val="000000"/>
+              </w:rPr>
+              <w:t>Overtaking (dB)</w:t>
+            </w:r>
+          </w:p>
+        </w:tc>
+        <w:tc>
+          <w:tcPr>
+            <w:tcW w:type="dxa" w:w="960"/>
+          </w:tcPr>
+          <w:p>
+            <w:r>
+              <w:rPr>
+                <w:b/>
+                <w:color w:val="000000"/>
+              </w:rPr>
+              <w:t>Conformity</w:t>
+            </w:r>
+          </w:p>
+        </w:tc>
+        <w:tc>
+          <w:tcPr>
+            <w:tcW w:type="dxa" w:w="960"/>
+          </w:tcPr>
+          <w:p>
+            <w:r>
+              <w:rPr>
+                <w:b/>
+                <w:color w:val="000000"/>
+              </w:rPr>
+              <w:t>Frequency (MHz)</w:t>
+            </w:r>
+          </w:p>
+        </w:tc>
+        <w:tc>
+          <w:tcPr>
+            <w:tcW w:type="dxa" w:w="960"/>
+          </w:tcPr>
+          <w:p>
+            <w:r>
+              <w:rPr>
+                <w:b/>
+                <w:color w:val="000000"/>
+              </w:rPr>
+              <w:t>Applied limit</w:t>
+            </w:r>
+          </w:p>
+        </w:tc>
+        <w:tc>
+          <w:tcPr>
+            <w:tcW w:type="dxa" w:w="960"/>
+          </w:tcPr>
+          <w:p>
+            <w:r>
+              <w:rPr>
+                <w:b/>
+                <w:color w:val="000000"/>
+              </w:rPr>
+              <w:t>Detector type</w:t>
+            </w:r>
+          </w:p>
+        </w:tc>
+        <w:tc>
+          <w:tcPr>
+            <w:tcW w:type="dxa" w:w="960"/>
+          </w:tcPr>
+          <w:p>
+            <w:r>
+              <w:rPr>
+                <w:b/>
+                <w:color w:val="000000"/>
+              </w:rPr>
+              <w:t>Comment</w:t>
+            </w:r>
+          </w:p>
+        </w:tc>
+      </w:tr>
+      <w:tr>
+        <w:tc>
+          <w:tcPr>
+            <w:tcW w:type="dxa" w:w="960"/>
+          </w:tcPr>
+          <w:p>
+            <w:r>
+              <w:t>1 (X)</w:t>
+            </w:r>
+          </w:p>
+        </w:tc>
+        <w:tc>
+          <w:tcPr>
+            <w:tcW w:type="dxa" w:w="960"/>
+          </w:tcPr>
+          <w:p>
+            <w:r>
+              <w:t>Vertical</w:t>
+            </w:r>
+          </w:p>
+        </w:tc>
+        <w:tc>
+          <w:tcPr>
+            <w:tcW w:type="dxa" w:w="960"/>
+          </w:tcPr>
+          <w:p>
+            <w:r>
+              <w:t>5</w:t>
+            </w:r>
+          </w:p>
+        </w:tc>
+        <w:tc>
+          <w:tcPr>
+            <w:tcW w:type="dxa" w:w="960"/>
+          </w:tcPr>
+          <w:p>
+            <w:r>
+              <w:t>-</w:t>
+            </w:r>
+          </w:p>
+        </w:tc>
+        <w:tc>
+          <w:tcPr>
+            <w:tcW w:type="dxa" w:w="960"/>
+          </w:tcPr>
+          <w:p>
+            <w:r>
+              <w:rPr>
+                <w:color w:val="008000"/>
+              </w:rPr>
+              <w:t>OK</w:t>
+            </w:r>
+          </w:p>
+        </w:tc>
+        <w:tc>
+          <w:tcPr>
+            <w:tcW w:type="dxa" w:w="960"/>
+          </w:tcPr>
+          <w:p>
+            <w:r>
+              <w:t>1175.910</w:t>
+            </w:r>
+          </w:p>
+        </w:tc>
+        <w:tc>
+          <w:tcPr>
+            <w:tcW w:type="dxa" w:w="960"/>
+          </w:tcPr>
+          <w:p>
+            <w:r>
+              <w:t>RNDS-C-00517 V4.0</w:t>
+            </w:r>
+          </w:p>
+        </w:tc>
+        <w:tc>
+          <w:tcPr>
+            <w:tcW w:type="dxa" w:w="960"/>
+          </w:tcPr>
+          <w:p>
+            <w:r>
+              <w:t>CISPR.AVG</w:t>
+            </w:r>
+          </w:p>
+        </w:tc>
+        <w:tc>
+          <w:tcPr>
+            <w:tcW w:type="dxa" w:w="960"/>
+          </w:tcPr>
+          <w:p>
+            <w:r>
+              <w:t>-</w:t>
+            </w:r>
+          </w:p>
+        </w:tc>
+      </w:tr>
+    </w:tbl>
     <w:sectPr>
       <w:footerReference w:type="default" r:id="rId9"/>
       <w:pgSz w:w="12240" w:h="15840"/>
@@ -867,7 +4039,7 @@
       <w:pStyle w:val="Footer"/>
     </w:pPr>
     <w:r>
-      <w:t>ElieTshingombe | 2025-09-23 22:23:10 | d0e70f4e3502fbecee56e4b79007d00c5c8516bbd67f0bd3f7fffcc8594524a7</w:t>
+      <w:t>ElieTshingombe | 2025-09-23 23:36:20 | 923227cd985af2b21f703f08206eb4aca962b1ce6c562e673574f7da58c03d87</w:t>
     </w:r>
   </w:p>
 </w:ftr>

</xml_diff>